<commit_message>
Update League Analyst Dossier
</commit_message>
<xml_diff>
--- a/docs/League_Analyst_Dossier.docx
+++ b/docs/League_Analyst_Dossier.docx
@@ -9,21 +9,21 @@
       <w:r>
         <w:rPr>
           <w:b/>
-          <w:color w:val="44546A"/>
           <w:sz w:val="22"/>
         </w:rPr>
-        <w:t>ANALYST ASSIGNMENT DOSSIER</w:t>
+        <w:t>JUSTICE LEAGUE INTERDIMENSIONAL OPERATIONS</w:t>
       </w:r>
     </w:p>
     <w:p>
       <w:pPr>
-        <w:pStyle w:val="Title"/>
         <w:jc w:val="center"/>
       </w:pPr>
       <w:r>
-        <w:t>Threat-Appropriate Deployment</w:t>
-        <w:br/>
-        <w:t>&amp; Damage Control Review</w:t>
+        <w:rPr>
+          <w:b/>
+          <w:sz w:val="48"/>
+        </w:rPr>
+        <w:t>League Analyst Dossier</w:t>
       </w:r>
     </w:p>
     <w:p>
@@ -33,12 +33,114 @@
       <w:r>
         <w:rPr>
           <w:i/>
-          <w:sz w:val="22"/>
+          <w:sz w:val="26"/>
         </w:rPr>
-        <w:t>Justice League Mission Oversight | Proof-of-Concept Analytics Assignment</w:t>
+        <w:t>Threat, Deployment, Damage &amp; Operational Value</w:t>
+      </w:r>
+    </w:p>
+    <w:p>
+      <w:pPr>
+        <w:jc w:val="center"/>
+      </w:pPr>
+      <w:r>
+        <w:rPr>
+          <w:sz w:val="20"/>
+        </w:rPr>
+        <w:t>PostgreSQL Analytics Project | Analyst Brief v2.0</w:t>
       </w:r>
     </w:p>
     <w:p/>
+    <w:p>
+      <w:pPr>
+        <w:pStyle w:val="Heading1"/>
+      </w:pPr>
+      <w:r>
+        <w:t>Executive Assignment</w:t>
+      </w:r>
+    </w:p>
+    <w:p>
+      <w:r>
+        <w:t>Leadership needs a defensible way to decide which heroes and teams should be deployed against a given threat. The objective is not to minimize damage at any cost. A deployment that produces little collateral damage but cannot stop the villain is not operationally successful. The analysis must balance threat capability, mission outcome, collateral damage, operating cost, and uncertainty.</w:t>
+      </w:r>
+    </w:p>
+    <w:p>
+      <w:pPr>
+        <w:jc w:val="center"/>
+      </w:pPr>
+      <w:r>
+        <w:rPr>
+          <w:b/>
+          <w:sz w:val="24"/>
+        </w:rPr>
+        <w:t>CENTRAL DECISION QUESTION</w:t>
+        <w:br/>
+        <w:t>What deployment provides sufficient capability for the villain and event threat while controlling avoidable collateral damage and total mission cost?</w:t>
+      </w:r>
+    </w:p>
+    <w:p>
+      <w:pPr>
+        <w:pStyle w:val="Heading1"/>
+      </w:pPr>
+      <w:r>
+        <w:t>Decision Framework</w:t>
+      </w:r>
+    </w:p>
+    <w:p>
+      <w:pPr>
+        <w:pStyle w:val="ListBullet"/>
+      </w:pPr>
+      <w:r>
+        <w:t>1. Capability first: Was the deployed force appropriate for the villain, event type, and threat level?</w:t>
+      </w:r>
+    </w:p>
+    <w:p>
+      <w:pPr>
+        <w:pStyle w:val="ListBullet"/>
+      </w:pPr>
+      <w:r>
+        <w:t>2. Outcome second: Did the deployment achieve the mission objective?</w:t>
+      </w:r>
+    </w:p>
+    <w:p>
+      <w:pPr>
+        <w:pStyle w:val="ListBullet"/>
+      </w:pPr>
+      <w:r>
+        <w:t>3. Damage in context: Was infrastructure damage reasonable for the event and mission type?</w:t>
+      </w:r>
+    </w:p>
+    <w:p>
+      <w:pPr>
+        <w:pStyle w:val="ListBullet"/>
+      </w:pPr>
+      <w:r>
+        <w:t>4. Attribution matters: How much damage can reasonably be attributed to the villain, the response, or a mixed/unknown cause?</w:t>
+      </w:r>
+    </w:p>
+    <w:p>
+      <w:pPr>
+        <w:pStyle w:val="ListBullet"/>
+      </w:pPr>
+      <w:r>
+        <w:t>5. Cost last, not ignored: Did operating and repair costs produce sufficient operational value?</w:t>
+      </w:r>
+    </w:p>
+    <w:p>
+      <w:pPr>
+        <w:pStyle w:val="ListBullet"/>
+      </w:pPr>
+      <w:r>
+        <w:t>6. Confidence matters: Preliminary or low-confidence estimates must not be presented as equally certain to final, high-confidence estimates.</w:t>
+      </w:r>
+    </w:p>
+    <w:p>
+      <w:pPr>
+        <w:pStyle w:val="Heading1"/>
+      </w:pPr>
+      <w:r>
+        <w:t>Available Analytical Evidence</w:t>
+      </w:r>
+    </w:p>
     <w:tbl>
       <w:tblPr>
         <w:tblStyle w:val="TableGrid"/>
@@ -54,25 +156,20 @@
         <w:tc>
           <w:tcPr>
             <w:tcW w:type="dxa" w:w="5040"/>
-            <w:vAlign w:val="center"/>
           </w:tcPr>
           <w:p>
             <w:r>
-              <w:rPr>
-                <w:b/>
-              </w:rPr>
-              <w:t>FROM</w:t>
+              <w:t>Data Area</w:t>
             </w:r>
           </w:p>
         </w:tc>
         <w:tc>
           <w:tcPr>
             <w:tcW w:type="dxa" w:w="5040"/>
-            <w:vAlign w:val="center"/>
           </w:tcPr>
           <w:p>
             <w:r>
-              <w:t>Director, International Superhuman Operations Analytics</w:t>
+              <w:t>What It Contributes</w:t>
             </w:r>
           </w:p>
         </w:tc>
@@ -81,25 +178,22 @@
         <w:tc>
           <w:tcPr>
             <w:tcW w:type="dxa" w:w="5040"/>
-            <w:vAlign w:val="center"/>
+            <w:vAlign w:val="top"/>
           </w:tcPr>
           <w:p>
             <w:r>
-              <w:rPr>
-                <w:b/>
-              </w:rPr>
-              <w:t>TO</w:t>
+              <w:t>Mission</w:t>
             </w:r>
           </w:p>
         </w:tc>
         <w:tc>
           <w:tcPr>
             <w:tcW w:type="dxa" w:w="5040"/>
-            <w:vAlign w:val="center"/>
+            <w:vAlign w:val="top"/>
           </w:tcPr>
           <w:p>
             <w:r>
-              <w:t>Liaison Analyst</w:t>
+              <w:t>Date, mission type, team, location, threat level, duration, outcome, operating cost, infrastructure damage, repair cost.</w:t>
             </w:r>
           </w:p>
         </w:tc>
@@ -108,25 +202,22 @@
         <w:tc>
           <w:tcPr>
             <w:tcW w:type="dxa" w:w="5040"/>
-            <w:vAlign w:val="center"/>
+            <w:vAlign w:val="top"/>
           </w:tcPr>
           <w:p>
             <w:r>
-              <w:rPr>
-                <w:b/>
-              </w:rPr>
-              <w:t>SUBJECT</w:t>
+              <w:t>Mission Agents</w:t>
             </w:r>
           </w:p>
         </w:tc>
         <w:tc>
           <w:tcPr>
             <w:tcW w:type="dxa" w:w="5040"/>
-            <w:vAlign w:val="center"/>
+            <w:vAlign w:val="top"/>
           </w:tcPr>
           <w:p>
             <w:r>
-              <w:t>Hero deployment effectiveness, villain threat classification, and infrastructure damage</w:t>
+              <w:t>The heroes actually deployed to each mission.</w:t>
             </w:r>
           </w:p>
         </w:tc>
@@ -135,25 +226,22 @@
         <w:tc>
           <w:tcPr>
             <w:tcW w:type="dxa" w:w="5040"/>
-            <w:vAlign w:val="center"/>
+            <w:vAlign w:val="top"/>
           </w:tcPr>
           <w:p>
             <w:r>
-              <w:rPr>
-                <w:b/>
-              </w:rPr>
-              <w:t>PRIORITY</w:t>
+              <w:t>Hero Damage Profiles</w:t>
             </w:r>
           </w:p>
         </w:tc>
         <w:tc>
           <w:tcPr>
             <w:tcW w:type="dxa" w:w="5040"/>
-            <w:vAlign w:val="center"/>
+            <w:vAlign w:val="top"/>
           </w:tcPr>
           <w:p>
             <w:r>
-              <w:t>Operational decision support</w:t>
+              <w:t>Expected and maximum hero damage by mission type.</w:t>
             </w:r>
           </w:p>
         </w:tc>
@@ -162,41 +250,257 @@
         <w:tc>
           <w:tcPr>
             <w:tcW w:type="dxa" w:w="5040"/>
-            <w:vAlign w:val="center"/>
+            <w:vAlign w:val="top"/>
           </w:tcPr>
           <w:p>
             <w:r>
-              <w:rPr>
-                <w:b/>
-              </w:rPr>
-              <w:t>ANALYTICAL STANDARD</w:t>
+              <w:t>Villains</w:t>
             </w:r>
           </w:p>
         </w:tc>
         <w:tc>
           <w:tcPr>
             <w:tcW w:type="dxa" w:w="5040"/>
-            <w:vAlign w:val="center"/>
+            <w:vAlign w:val="top"/>
           </w:tcPr>
           <w:p>
             <w:r>
-              <w:t>Mission effectiveness first; minimize avoidable damage within an effective response</w:t>
+              <w:t>Villain identity, threat characteristics, affiliation, and damage profile.</w:t>
+            </w:r>
+          </w:p>
+        </w:tc>
+      </w:tr>
+      <w:tr>
+        <w:tc>
+          <w:tcPr>
+            <w:tcW w:type="dxa" w:w="5040"/>
+            <w:vAlign w:val="top"/>
+          </w:tcPr>
+          <w:p>
+            <w:r>
+              <w:t>Villain Event Types</w:t>
+            </w:r>
+          </w:p>
+        </w:tc>
+        <w:tc>
+          <w:tcPr>
+            <w:tcW w:type="dxa" w:w="5040"/>
+            <w:vAlign w:val="top"/>
+          </w:tcPr>
+          <w:p>
+            <w:r>
+              <w:t>Typical damage range, damage tolerance, and event context.</w:t>
+            </w:r>
+          </w:p>
+        </w:tc>
+      </w:tr>
+      <w:tr>
+        <w:tc>
+          <w:tcPr>
+            <w:tcW w:type="dxa" w:w="5040"/>
+            <w:vAlign w:val="top"/>
+          </w:tcPr>
+          <w:p>
+            <w:r>
+              <w:t>Villain Missions</w:t>
+            </w:r>
+          </w:p>
+        </w:tc>
+        <w:tc>
+          <w:tcPr>
+            <w:tcW w:type="dxa" w:w="5040"/>
+            <w:vAlign w:val="top"/>
+          </w:tcPr>
+          <w:p>
+            <w:r>
+              <w:t>Villain/event assignment, actual damage, attribution, estimate status, confidence, and analyst notes.</w:t>
+            </w:r>
+          </w:p>
+        </w:tc>
+      </w:tr>
+      <w:tr>
+        <w:tc>
+          <w:tcPr>
+            <w:tcW w:type="dxa" w:w="5040"/>
+            <w:vAlign w:val="top"/>
+          </w:tcPr>
+          <w:p>
+            <w:r>
+              <w:t>Vehicles</w:t>
+            </w:r>
+          </w:p>
+        </w:tc>
+        <w:tc>
+          <w:tcPr>
+            <w:tcW w:type="dxa" w:w="5040"/>
+            <w:vAlign w:val="top"/>
+          </w:tcPr>
+          <w:p>
+            <w:r>
+              <w:t>Mission resources and team/owner vehicle deployment.</w:t>
             </w:r>
           </w:p>
         </w:tc>
       </w:tr>
     </w:tbl>
-    <w:p/>
     <w:p>
       <w:pPr>
-        <w:jc w:val="center"/>
+        <w:pStyle w:val="Heading1"/>
       </w:pPr>
       <w:r>
-        <w:rPr>
-          <w:b/>
-          <w:sz w:val="18"/>
-        </w:rPr>
-        <w:t>CONTROLLED ANALYTICAL EXERCISE</w:t>
+        <w:t>Core Analytical Measures</w:t>
+      </w:r>
+    </w:p>
+    <w:p>
+      <w:pPr>
+        <w:pStyle w:val="ListBullet"/>
+      </w:pPr>
+      <w:r>
+        <w:t>Mission Count and Success Rate</w:t>
+      </w:r>
+    </w:p>
+    <w:p>
+      <w:pPr>
+        <w:pStyle w:val="ListBullet"/>
+      </w:pPr>
+      <w:r>
+        <w:t>Operating Cost, Repair Cost, and Total Mission Impact</w:t>
+      </w:r>
+    </w:p>
+    <w:p>
+      <w:pPr>
+        <w:pStyle w:val="ListBullet"/>
+      </w:pPr>
+      <w:r>
+        <w:t>Infrastructure Damage</w:t>
+      </w:r>
+    </w:p>
+    <w:p>
+      <w:pPr>
+        <w:pStyle w:val="ListBullet"/>
+      </w:pPr>
+      <w:r>
+        <w:t>Villain Actual Damage</w:t>
+      </w:r>
+    </w:p>
+    <w:p>
+      <w:pPr>
+        <w:pStyle w:val="ListBullet"/>
+      </w:pPr>
+      <w:r>
+        <w:t>Event-Type Typical Damage Range</w:t>
+      </w:r>
+    </w:p>
+    <w:p>
+      <w:pPr>
+        <w:pStyle w:val="ListBullet"/>
+      </w:pPr>
+      <w:r>
+        <w:t>Expected Hero Damage and Maximum Hero Damage</w:t>
+      </w:r>
+    </w:p>
+    <w:p>
+      <w:pPr>
+        <w:pStyle w:val="ListBullet"/>
+      </w:pPr>
+      <w:r>
+        <w:t>Damage Variance: observed mission damage compared with an appropriate expected benchmark</w:t>
+      </w:r>
+    </w:p>
+    <w:p>
+      <w:pPr>
+        <w:pStyle w:val="ListBullet"/>
+      </w:pPr>
+      <w:r>
+        <w:t>Cost per Successful Mission</w:t>
+      </w:r>
+    </w:p>
+    <w:p>
+      <w:pPr>
+        <w:pStyle w:val="ListBullet"/>
+      </w:pPr>
+      <w:r>
+        <w:t>Damage per Successful Mission</w:t>
+      </w:r>
+    </w:p>
+    <w:p>
+      <w:pPr>
+        <w:pStyle w:val="ListBullet"/>
+      </w:pPr>
+      <w:r>
+        <w:t>Deployment Frequency by Hero and Team</w:t>
+      </w:r>
+    </w:p>
+    <w:p>
+      <w:pPr>
+        <w:pStyle w:val="ListBullet"/>
+      </w:pPr>
+      <w:r>
+        <w:t>Estimate Status and Confidence</w:t>
+      </w:r>
+    </w:p>
+    <w:p>
+      <w:pPr>
+        <w:pStyle w:val="ListBullet"/>
+      </w:pPr>
+      <w:r>
+        <w:t>Damage Attribution</w:t>
+      </w:r>
+    </w:p>
+    <w:p>
+      <w:pPr>
+        <w:pStyle w:val="Heading1"/>
+      </w:pPr>
+      <w:r>
+        <w:t>Analytical Guardrails</w:t>
+      </w:r>
+    </w:p>
+    <w:p>
+      <w:pPr>
+        <w:pStyle w:val="ListBullet"/>
+      </w:pPr>
+      <w:r>
+        <w:t>Do not treat all mission damage as hero-caused damage.</w:t>
+      </w:r>
+    </w:p>
+    <w:p>
+      <w:pPr>
+        <w:pStyle w:val="ListBullet"/>
+      </w:pPr>
+      <w:r>
+        <w:t>Do not treat all villain ActualDamage as perfectly measured when EstimateStatus or EstimateConfidence indicates uncertainty.</w:t>
+      </w:r>
+    </w:p>
+    <w:p>
+      <w:pPr>
+        <w:pStyle w:val="ListBullet"/>
+      </w:pPr>
+      <w:r>
+        <w:t>Do not call high damage poor performance without considering mission type, event type, threat severity, outcome, and attribution.</w:t>
+      </w:r>
+    </w:p>
+    <w:p>
+      <w:pPr>
+        <w:pStyle w:val="ListBullet"/>
+      </w:pPr>
+      <w:r>
+        <w:t>Do not recommend the lowest-damage team unless the evidence also supports adequate capability for the threat.</w:t>
+      </w:r>
+    </w:p>
+    <w:p>
+      <w:pPr>
+        <w:pStyle w:val="ListBullet"/>
+      </w:pPr>
+      <w:r>
+        <w:t>Do not infer causation from a small observational sample. Describe associations and operational patterns unless stronger evidence exists.</w:t>
+      </w:r>
+    </w:p>
+    <w:p>
+      <w:pPr>
+        <w:pStyle w:val="ListBullet"/>
+      </w:pPr>
+      <w:r>
+        <w:t>Where the data cannot separate villain-caused damage from response-caused damage, label the limitation instead of manufacturing precision.</w:t>
       </w:r>
     </w:p>
     <w:p>
@@ -209,1168 +513,787 @@
         <w:pStyle w:val="Heading1"/>
       </w:pPr>
       <w:r>
-        <w:t>1. Executive Assignment</w:t>
+        <w:t>Required Mission-Type Analysis</w:t>
       </w:r>
     </w:p>
     <w:p>
       <w:r>
-        <w:t>International stakeholders require a defensible framework for evaluating Justice League deployments against villain threats. The objective is not to minimize property damage at any cost. The objective is to identify the least-destructive response that remains strong enough to achieve the mission, protect civilians, and contain or neutralize the threat.</w:t>
+        <w:t>For every mission type in the database, answer the same three questions. This creates a consistent analytical spine across the project while still allowing the SQL and conclusions to change with mission context.</w:t>
+      </w:r>
+    </w:p>
+    <w:p>
+      <w:pPr>
+        <w:pStyle w:val="Heading2"/>
+      </w:pPr>
+      <w:r>
+        <w:t>Reconnaissance  |  Damage Tolerance: Very Low</w:t>
+      </w:r>
+    </w:p>
+    <w:p>
+      <w:pPr>
+        <w:pStyle w:val="ListBullet"/>
+      </w:pPr>
+      <w:r>
+        <w:t>Threat &amp; Capability: What villains/event types appeared, how severe were they, and did the deployed heroes provide an appropriate level of capability?</w:t>
+      </w:r>
+    </w:p>
+    <w:p>
+      <w:pPr>
+        <w:pStyle w:val="ListBullet"/>
+      </w:pPr>
+      <w:r>
+        <w:t>Outcome &amp; Damage: Did the mission succeed, and was observed damage reasonable after considering event benchmarks, hero damage profiles, attribution, and estimate confidence?</w:t>
+      </w:r>
+    </w:p>
+    <w:p>
+      <w:pPr>
+        <w:pStyle w:val="ListBullet"/>
+      </w:pPr>
+      <w:r>
+        <w:t>Recommendation: Based on the evidence, what deployment or operational adjustment should leadership consider for future missions of this type, and what tradeoff does that recommendation create?</w:t>
+      </w:r>
+    </w:p>
+    <w:p>
+      <w:pPr>
+        <w:pStyle w:val="Heading2"/>
+      </w:pPr>
+      <w:r>
+        <w:t>Patrol  |  Damage Tolerance: Low</w:t>
+      </w:r>
+    </w:p>
+    <w:p>
+      <w:pPr>
+        <w:pStyle w:val="ListBullet"/>
+      </w:pPr>
+      <w:r>
+        <w:t>Threat &amp; Capability: What villains/event types appeared, how severe were they, and did the deployed heroes provide an appropriate level of capability?</w:t>
+      </w:r>
+    </w:p>
+    <w:p>
+      <w:pPr>
+        <w:pStyle w:val="ListBullet"/>
+      </w:pPr>
+      <w:r>
+        <w:t>Outcome &amp; Damage: Did the mission succeed, and was observed damage reasonable after considering event benchmarks, hero damage profiles, attribution, and estimate confidence?</w:t>
+      </w:r>
+    </w:p>
+    <w:p>
+      <w:pPr>
+        <w:pStyle w:val="ListBullet"/>
+      </w:pPr>
+      <w:r>
+        <w:t>Recommendation: Based on the evidence, what deployment or operational adjustment should leadership consider for future missions of this type, and what tradeoff does that recommendation create?</w:t>
+      </w:r>
+    </w:p>
+    <w:p>
+      <w:pPr>
+        <w:pStyle w:val="Heading2"/>
+      </w:pPr>
+      <w:r>
+        <w:t>Investigation  |  Damage Tolerance: Low</w:t>
+      </w:r>
+    </w:p>
+    <w:p>
+      <w:pPr>
+        <w:pStyle w:val="ListBullet"/>
+      </w:pPr>
+      <w:r>
+        <w:t>Threat &amp; Capability: What villains/event types appeared, how severe were they, and did the deployed heroes provide an appropriate level of capability?</w:t>
+      </w:r>
+    </w:p>
+    <w:p>
+      <w:pPr>
+        <w:pStyle w:val="ListBullet"/>
+      </w:pPr>
+      <w:r>
+        <w:t>Outcome &amp; Damage: Did the mission succeed, and was observed damage reasonable after considering event benchmarks, hero damage profiles, attribution, and estimate confidence?</w:t>
+      </w:r>
+    </w:p>
+    <w:p>
+      <w:pPr>
+        <w:pStyle w:val="ListBullet"/>
+      </w:pPr>
+      <w:r>
+        <w:t>Recommendation: Based on the evidence, what deployment or operational adjustment should leadership consider for future missions of this type, and what tradeoff does that recommendation create?</w:t>
+      </w:r>
+    </w:p>
+    <w:p>
+      <w:pPr>
+        <w:pStyle w:val="Heading2"/>
+      </w:pPr>
+      <w:r>
+        <w:t>Extraction  |  Damage Tolerance: Moderate</w:t>
+      </w:r>
+    </w:p>
+    <w:p>
+      <w:pPr>
+        <w:pStyle w:val="ListBullet"/>
+      </w:pPr>
+      <w:r>
+        <w:t>Threat &amp; Capability: What villains/event types appeared, how severe were they, and did the deployed heroes provide an appropriate level of capability?</w:t>
+      </w:r>
+    </w:p>
+    <w:p>
+      <w:pPr>
+        <w:pStyle w:val="ListBullet"/>
+      </w:pPr>
+      <w:r>
+        <w:t>Outcome &amp; Damage: Did the mission succeed, and was observed damage reasonable after considering event benchmarks, hero damage profiles, attribution, and estimate confidence?</w:t>
+      </w:r>
+    </w:p>
+    <w:p>
+      <w:pPr>
+        <w:pStyle w:val="ListBullet"/>
+      </w:pPr>
+      <w:r>
+        <w:t>Recommendation: Based on the evidence, what deployment or operational adjustment should leadership consider for future missions of this type, and what tradeoff does that recommendation create?</w:t>
+      </w:r>
+    </w:p>
+    <w:p>
+      <w:pPr>
+        <w:pStyle w:val="Heading2"/>
+      </w:pPr>
+      <w:r>
+        <w:t>Rescue  |  Damage Tolerance: Moderate</w:t>
+      </w:r>
+    </w:p>
+    <w:p>
+      <w:pPr>
+        <w:pStyle w:val="ListBullet"/>
+      </w:pPr>
+      <w:r>
+        <w:t>Threat &amp; Capability: What villains/event types appeared, how severe were they, and did the deployed heroes provide an appropriate level of capability?</w:t>
+      </w:r>
+    </w:p>
+    <w:p>
+      <w:pPr>
+        <w:pStyle w:val="ListBullet"/>
+      </w:pPr>
+      <w:r>
+        <w:t>Outcome &amp; Damage: Did the mission succeed, and was observed damage reasonable after considering event benchmarks, hero damage profiles, attribution, and estimate confidence?</w:t>
+      </w:r>
+    </w:p>
+    <w:p>
+      <w:pPr>
+        <w:pStyle w:val="ListBullet"/>
+      </w:pPr>
+      <w:r>
+        <w:t>Recommendation: Based on the evidence, what deployment or operational adjustment should leadership consider for future missions of this type, and what tradeoff does that recommendation create?</w:t>
+      </w:r>
+    </w:p>
+    <w:p>
+      <w:pPr>
+        <w:pStyle w:val="Heading2"/>
+      </w:pPr>
+      <w:r>
+        <w:t>Containment  |  Damage Tolerance: High</w:t>
+      </w:r>
+    </w:p>
+    <w:p>
+      <w:pPr>
+        <w:pStyle w:val="ListBullet"/>
+      </w:pPr>
+      <w:r>
+        <w:t>Threat &amp; Capability: What villains/event types appeared, how severe were they, and did the deployed heroes provide an appropriate level of capability?</w:t>
+      </w:r>
+    </w:p>
+    <w:p>
+      <w:pPr>
+        <w:pStyle w:val="ListBullet"/>
+      </w:pPr>
+      <w:r>
+        <w:t>Outcome &amp; Damage: Did the mission succeed, and was observed damage reasonable after considering event benchmarks, hero damage profiles, attribution, and estimate confidence?</w:t>
+      </w:r>
+    </w:p>
+    <w:p>
+      <w:pPr>
+        <w:pStyle w:val="ListBullet"/>
+      </w:pPr>
+      <w:r>
+        <w:t>Recommendation: Based on the evidence, what deployment or operational adjustment should leadership consider for future missions of this type, and what tradeoff does that recommendation create?</w:t>
+      </w:r>
+    </w:p>
+    <w:p>
+      <w:pPr>
+        <w:pStyle w:val="Heading2"/>
+      </w:pPr>
+      <w:r>
+        <w:t>Evacuation  |  Damage Tolerance: High</w:t>
+      </w:r>
+    </w:p>
+    <w:p>
+      <w:pPr>
+        <w:pStyle w:val="ListBullet"/>
+      </w:pPr>
+      <w:r>
+        <w:t>Threat &amp; Capability: What villains/event types appeared, how severe were they, and did the deployed heroes provide an appropriate level of capability?</w:t>
+      </w:r>
+    </w:p>
+    <w:p>
+      <w:pPr>
+        <w:pStyle w:val="ListBullet"/>
+      </w:pPr>
+      <w:r>
+        <w:t>Outcome &amp; Damage: Did the mission succeed, and was observed damage reasonable after considering event benchmarks, hero damage profiles, attribution, and estimate confidence?</w:t>
+      </w:r>
+    </w:p>
+    <w:p>
+      <w:pPr>
+        <w:pStyle w:val="ListBullet"/>
+      </w:pPr>
+      <w:r>
+        <w:t>Recommendation: Based on the evidence, what deployment or operational adjustment should leadership consider for future missions of this type, and what tradeoff does that recommendation create?</w:t>
+      </w:r>
+    </w:p>
+    <w:p>
+      <w:pPr>
+        <w:pStyle w:val="Heading2"/>
+      </w:pPr>
+      <w:r>
+        <w:t>Disaster Response  |  Damage Tolerance: High</w:t>
+      </w:r>
+    </w:p>
+    <w:p>
+      <w:pPr>
+        <w:pStyle w:val="ListBullet"/>
+      </w:pPr>
+      <w:r>
+        <w:t>Threat &amp; Capability: What villains/event types appeared, how severe were they, and did the deployed heroes provide an appropriate level of capability?</w:t>
+      </w:r>
+    </w:p>
+    <w:p>
+      <w:pPr>
+        <w:pStyle w:val="ListBullet"/>
+      </w:pPr>
+      <w:r>
+        <w:t>Outcome &amp; Damage: Did the mission succeed, and was observed damage reasonable after considering event benchmarks, hero damage profiles, attribution, and estimate confidence?</w:t>
+      </w:r>
+    </w:p>
+    <w:p>
+      <w:pPr>
+        <w:pStyle w:val="ListBullet"/>
+      </w:pPr>
+      <w:r>
+        <w:t>Recommendation: Based on the evidence, what deployment or operational adjustment should leadership consider for future missions of this type, and what tradeoff does that recommendation create?</w:t>
+      </w:r>
+    </w:p>
+    <w:p>
+      <w:pPr>
+        <w:pStyle w:val="Heading2"/>
+      </w:pPr>
+      <w:r>
+        <w:t>Combat  |  Damage Tolerance: Very High</w:t>
+      </w:r>
+    </w:p>
+    <w:p>
+      <w:pPr>
+        <w:pStyle w:val="ListBullet"/>
+      </w:pPr>
+      <w:r>
+        <w:t>Threat &amp; Capability: What villains/event types appeared, how severe were they, and did the deployed heroes provide an appropriate level of capability?</w:t>
+      </w:r>
+    </w:p>
+    <w:p>
+      <w:pPr>
+        <w:pStyle w:val="ListBullet"/>
+      </w:pPr>
+      <w:r>
+        <w:t>Outcome &amp; Damage: Did the mission succeed, and was observed damage reasonable after considering event benchmarks, hero damage profiles, attribution, and estimate confidence?</w:t>
+      </w:r>
+    </w:p>
+    <w:p>
+      <w:pPr>
+        <w:pStyle w:val="ListBullet"/>
+      </w:pPr>
+      <w:r>
+        <w:t>Recommendation: Based on the evidence, what deployment or operational adjustment should leadership consider for future missions of this type, and what tradeoff does that recommendation create?</w:t>
+      </w:r>
+    </w:p>
+    <w:p>
+      <w:pPr>
+        <w:pStyle w:val="Heading2"/>
+      </w:pPr>
+      <w:r>
+        <w:t>Major Threat  |  Damage Tolerance: Very High</w:t>
+      </w:r>
+    </w:p>
+    <w:p>
+      <w:pPr>
+        <w:pStyle w:val="ListBullet"/>
+      </w:pPr>
+      <w:r>
+        <w:t>Threat &amp; Capability: What villains/event types appeared, how severe were they, and did the deployed heroes provide an appropriate level of capability?</w:t>
+      </w:r>
+    </w:p>
+    <w:p>
+      <w:pPr>
+        <w:pStyle w:val="ListBullet"/>
+      </w:pPr>
+      <w:r>
+        <w:t>Outcome &amp; Damage: Did the mission succeed, and was observed damage reasonable after considering event benchmarks, hero damage profiles, attribution, and estimate confidence?</w:t>
+      </w:r>
+    </w:p>
+    <w:p>
+      <w:pPr>
+        <w:pStyle w:val="ListBullet"/>
+      </w:pPr>
+      <w:r>
+        <w:t>Recommendation: Based on the evidence, what deployment or operational adjustment should leadership consider for future missions of this type, and what tradeoff does that recommendation create?</w:t>
+      </w:r>
+    </w:p>
+    <w:p>
+      <w:pPr>
+        <w:pStyle w:val="Heading2"/>
+      </w:pPr>
+      <w:r>
+        <w:t>Catastrophic Event  |  Damage Tolerance: Extreme</w:t>
+      </w:r>
+    </w:p>
+    <w:p>
+      <w:pPr>
+        <w:pStyle w:val="ListBullet"/>
+      </w:pPr>
+      <w:r>
+        <w:t>Threat &amp; Capability: What villains/event types appeared, how severe were they, and did the deployed heroes provide an appropriate level of capability?</w:t>
+      </w:r>
+    </w:p>
+    <w:p>
+      <w:pPr>
+        <w:pStyle w:val="ListBullet"/>
+      </w:pPr>
+      <w:r>
+        <w:t>Outcome &amp; Damage: Did the mission succeed, and was observed damage reasonable after considering event benchmarks, hero damage profiles, attribution, and estimate confidence?</w:t>
+      </w:r>
+    </w:p>
+    <w:p>
+      <w:pPr>
+        <w:pStyle w:val="ListBullet"/>
+      </w:pPr>
+      <w:r>
+        <w:t>Recommendation: Based on the evidence, what deployment or operational adjustment should leadership consider for future missions of this type, and what tradeoff does that recommendation create?</w:t>
+      </w:r>
+    </w:p>
+    <w:p>
+      <w:pPr>
+        <w:pStyle w:val="Heading1"/>
+      </w:pPr>
+      <w:r>
+        <w:t>Cross-Mission Investigations</w:t>
+      </w:r>
+    </w:p>
+    <w:p>
+      <w:pPr>
+        <w:pStyle w:val="Heading2"/>
+      </w:pPr>
+      <w:r>
+        <w:t>1. Villain Threat Analysis</w:t>
+      </w:r>
+    </w:p>
+    <w:p>
+      <w:pPr>
+        <w:pStyle w:val="ListBullet"/>
+      </w:pPr>
+      <w:r>
+        <w:t>Which villains are associated with the greatest actual damage?</w:t>
+      </w:r>
+    </w:p>
+    <w:p>
+      <w:pPr>
+        <w:pStyle w:val="ListBullet"/>
+      </w:pPr>
+      <w:r>
+        <w:t>Which villains repeatedly generate damage near or above the normal range for their event type?</w:t>
+      </w:r>
+    </w:p>
+    <w:p>
+      <w:pPr>
+        <w:pStyle w:val="ListBullet"/>
+      </w:pPr>
+      <w:r>
+        <w:t>Which event types produce the largest financial exposure?</w:t>
+      </w:r>
+    </w:p>
+    <w:p>
+      <w:pPr>
+        <w:pStyle w:val="ListBullet"/>
+      </w:pPr>
+      <w:r>
+        <w:t>Which villains or event types are associated with the lowest estimate confidence?</w:t>
+      </w:r>
+    </w:p>
+    <w:p>
+      <w:pPr>
+        <w:pStyle w:val="ListBullet"/>
+      </w:pPr>
+      <w:r>
+        <w:t>Which hero/team deployments have succeeded against particular villains, event types, or threat levels?</w:t>
+      </w:r>
+    </w:p>
+    <w:p>
+      <w:pPr>
+        <w:pStyle w:val="Heading2"/>
+      </w:pPr>
+      <w:r>
+        <w:t>2. Mission Performance</w:t>
+      </w:r>
+    </w:p>
+    <w:p>
+      <w:pPr>
+        <w:pStyle w:val="ListBullet"/>
+      </w:pPr>
+      <w:r>
+        <w:t>What is the overall mission success rate, and how does it vary by mission type and threat level?</w:t>
+      </w:r>
+    </w:p>
+    <w:p>
+      <w:pPr>
+        <w:pStyle w:val="ListBullet"/>
+      </w:pPr>
+      <w:r>
+        <w:t>Which mission types have the greatest failure or partial-success rates?</w:t>
+      </w:r>
+    </w:p>
+    <w:p>
+      <w:pPr>
+        <w:pStyle w:val="ListBullet"/>
+      </w:pPr>
+      <w:r>
+        <w:t>Does mission duration or number of deployed teams appear associated with outcome?</w:t>
+      </w:r>
+    </w:p>
+    <w:p>
+      <w:pPr>
+        <w:pStyle w:val="ListBullet"/>
+      </w:pPr>
+      <w:r>
+        <w:t>Which missions achieved strong outcomes despite unusually difficult threat conditions?</w:t>
+      </w:r>
+    </w:p>
+    <w:p>
+      <w:pPr>
+        <w:pStyle w:val="Heading2"/>
+      </w:pPr>
+      <w:r>
+        <w:t>3. Damage &amp; Attribution</w:t>
+      </w:r>
+    </w:p>
+    <w:p>
+      <w:pPr>
+        <w:pStyle w:val="ListBullet"/>
+      </w:pPr>
+      <w:r>
+        <w:t>How does infrastructure damage compare with villain actual damage and event-type benchmarks?</w:t>
+      </w:r>
+    </w:p>
+    <w:p>
+      <w:pPr>
+        <w:pStyle w:val="ListBullet"/>
+      </w:pPr>
+      <w:r>
+        <w:t>Which missions have Mixed or Mixed / Unknown damage attribution?</w:t>
+      </w:r>
+    </w:p>
+    <w:p>
+      <w:pPr>
+        <w:pStyle w:val="ListBullet"/>
+      </w:pPr>
+      <w:r>
+        <w:t>Where would assigning all damage to the responding heroes create a misleading conclusion?</w:t>
+      </w:r>
+    </w:p>
+    <w:p>
+      <w:pPr>
+        <w:pStyle w:val="ListBullet"/>
+      </w:pPr>
+      <w:r>
+        <w:t>Which missions have unusually high damage after accounting for mission type and threat context?</w:t>
+      </w:r>
+    </w:p>
+    <w:p>
+      <w:pPr>
+        <w:pStyle w:val="Heading2"/>
+      </w:pPr>
+      <w:r>
+        <w:t>4. Hero Deployment &amp; Expected Damage</w:t>
+      </w:r>
+    </w:p>
+    <w:p>
+      <w:pPr>
+        <w:pStyle w:val="ListBullet"/>
+      </w:pPr>
+      <w:r>
+        <w:t>How often is each hero deployed, and for which mission types?</w:t>
+      </w:r>
+    </w:p>
+    <w:p>
+      <w:pPr>
+        <w:pStyle w:val="ListBullet"/>
+      </w:pPr>
+      <w:r>
+        <w:t>How does each deployed hero's expected damage profile compare with the mission's observed damage context?</w:t>
+      </w:r>
+    </w:p>
+    <w:p>
+      <w:pPr>
+        <w:pStyle w:val="ListBullet"/>
+      </w:pPr>
+      <w:r>
+        <w:t>Which heroes appear particularly useful in low-damage missions?</w:t>
+      </w:r>
+    </w:p>
+    <w:p>
+      <w:pPr>
+        <w:pStyle w:val="ListBullet"/>
+      </w:pPr>
+      <w:r>
+        <w:t>Which heroes appear suited to high-threat missions where greater damage tolerance is acceptable?</w:t>
+      </w:r>
+    </w:p>
+    <w:p>
+      <w:pPr>
+        <w:pStyle w:val="ListBullet"/>
+      </w:pPr>
+      <w:r>
+        <w:t>Are heroes being deployed outside mission types where their profiles suggest the greatest operational value?</w:t>
+      </w:r>
+    </w:p>
+    <w:p>
+      <w:pPr>
+        <w:pStyle w:val="Heading2"/>
+      </w:pPr>
+      <w:r>
+        <w:t>5. Team Performance</w:t>
+      </w:r>
+    </w:p>
+    <w:p>
+      <w:pPr>
+        <w:pStyle w:val="ListBullet"/>
+      </w:pPr>
+      <w:r>
+        <w:t>How do teams differ in success rate, operating cost, repair cost, and damage per successful mission?</w:t>
+      </w:r>
+    </w:p>
+    <w:p>
+      <w:pPr>
+        <w:pStyle w:val="ListBullet"/>
+      </w:pPr>
+      <w:r>
+        <w:t>Do some teams appear especially effective against certain threat levels, villains, or event types?</w:t>
+      </w:r>
+    </w:p>
+    <w:p>
+      <w:pPr>
+        <w:pStyle w:val="ListBullet"/>
+      </w:pPr>
+      <w:r>
+        <w:t>Does team composition appear associated with mission outcome or damage?</w:t>
+      </w:r>
+    </w:p>
+    <w:p>
+      <w:pPr>
+        <w:pStyle w:val="ListBullet"/>
+      </w:pPr>
+      <w:r>
+        <w:t>Where does a team appear efficient because it controls damage without sacrificing mission success?</w:t>
+      </w:r>
+    </w:p>
+    <w:p>
+      <w:pPr>
+        <w:pStyle w:val="Heading2"/>
+      </w:pPr>
+      <w:r>
+        <w:t>6. Cost &amp; Operational Value</w:t>
+      </w:r>
+    </w:p>
+    <w:p>
+      <w:pPr>
+        <w:pStyle w:val="ListBullet"/>
+      </w:pPr>
+      <w:r>
+        <w:t>What does a successful mission cost by mission type and threat level?</w:t>
+      </w:r>
+    </w:p>
+    <w:p>
+      <w:pPr>
+        <w:pStyle w:val="ListBullet"/>
+      </w:pPr>
+      <w:r>
+        <w:t>Which missions combine high operating cost with poor outcomes?</w:t>
+      </w:r>
+    </w:p>
+    <w:p>
+      <w:pPr>
+        <w:pStyle w:val="ListBullet"/>
+      </w:pPr>
+      <w:r>
+        <w:t>Which missions justify higher operating cost through stronger outcomes or lower damage?</w:t>
+      </w:r>
+    </w:p>
+    <w:p>
+      <w:pPr>
+        <w:pStyle w:val="ListBullet"/>
+      </w:pPr>
+      <w:r>
+        <w:t>What is total mission impact: operating cost plus repair cost?</w:t>
+      </w:r>
+    </w:p>
+    <w:p>
+      <w:pPr>
+        <w:pStyle w:val="ListBullet"/>
+      </w:pPr>
+      <w:r>
+        <w:t>Where might reducing operating cost create greater damage, repair expense, or operational risk?</w:t>
+      </w:r>
+    </w:p>
+    <w:p>
+      <w:pPr>
+        <w:pStyle w:val="Heading2"/>
+      </w:pPr>
+      <w:r>
+        <w:t>7. Outliers &amp; Exceptions</w:t>
+      </w:r>
+    </w:p>
+    <w:p>
+      <w:pPr>
+        <w:pStyle w:val="ListBullet"/>
+      </w:pPr>
+      <w:r>
+        <w:t>Which missions are statistical or operational outliers for cost, damage, duration, or outcome?</w:t>
+      </w:r>
+    </w:p>
+    <w:p>
+      <w:pPr>
+        <w:pStyle w:val="ListBullet"/>
+      </w:pPr>
+      <w:r>
+        <w:t>Which villains or heroes appear in unusually high-damage events?</w:t>
+      </w:r>
+    </w:p>
+    <w:p>
+      <w:pPr>
+        <w:pStyle w:val="ListBullet"/>
+      </w:pPr>
+      <w:r>
+        <w:t>Which observations contradict the broader pattern and deserve investigation?</w:t>
+      </w:r>
+    </w:p>
+    <w:p>
+      <w:pPr>
+        <w:pStyle w:val="ListBullet"/>
+      </w:pPr>
+      <w:r>
+        <w:t>Are apparent outliers driven by preliminary or low-confidence damage estimates?</w:t>
+      </w:r>
+    </w:p>
+    <w:p>
+      <w:pPr>
+        <w:pStyle w:val="Heading1"/>
+      </w:pPr>
+      <w:r>
+        <w:t>Executive Deliverables</w:t>
       </w:r>
     </w:p>
     <w:p>
       <w:r>
-        <w:t>You are directed to analyze historical mission, villain, hero, team, cost, outcome, and damage data and determine whether deployment patterns can support better future recommendations. Your work must distinguish necessary damage associated with an appropriately forceful response from avoidable damage caused by over-deployment, poor matching, prolonged missions, or ineffective response.</w:t>
+        <w:t>The final analysis should not be a leaderboard of heroes. It should give leadership a compact decision model supported by SQL evidence. The finished portfolio project should produce:</w:t>
       </w:r>
     </w:p>
     <w:p>
       <w:pPr>
+        <w:pStyle w:val="ListBullet"/>
+      </w:pPr>
+      <w:r>
+        <w:t>A validated PostgreSQL dataset with documented relationships and integrity checks.</w:t>
+      </w:r>
+    </w:p>
+    <w:p>
+      <w:pPr>
+        <w:pStyle w:val="ListBullet"/>
+      </w:pPr>
+      <w:r>
+        <w:t>SQL analysis files organized around the dossier questions.</w:t>
+      </w:r>
+    </w:p>
+    <w:p>
+      <w:pPr>
+        <w:pStyle w:val="ListBullet"/>
+      </w:pPr>
+      <w:r>
+        <w:t>A mission-type assessment answering the three required questions for each mission type.</w:t>
+      </w:r>
+    </w:p>
+    <w:p>
+      <w:pPr>
+        <w:pStyle w:val="ListBullet"/>
+      </w:pPr>
+      <w:r>
+        <w:t>A villain-threat assessment identifying meaningful damage, event, and uncertainty patterns.</w:t>
+      </w:r>
+    </w:p>
+    <w:p>
+      <w:pPr>
+        <w:pStyle w:val="ListBullet"/>
+      </w:pPr>
+      <w:r>
+        <w:t>A deployment assessment explaining capability-versus-damage tradeoffs.</w:t>
+      </w:r>
+    </w:p>
+    <w:p>
+      <w:pPr>
+        <w:pStyle w:val="ListBullet"/>
+      </w:pPr>
+      <w:r>
+        <w:t>A concise set of leadership recommendations with supporting metrics and stated limitations.</w:t>
+      </w:r>
+    </w:p>
+    <w:p>
+      <w:pPr>
+        <w:pStyle w:val="ListBullet"/>
+      </w:pPr>
+      <w:r>
+        <w:t>A portfolio-ready summary showing the analytical process from raw data to operational recommendation.</w:t>
+      </w:r>
+    </w:p>
+    <w:p>
+      <w:pPr>
         <w:pStyle w:val="Heading1"/>
       </w:pPr>
       <w:r>
-        <w:t>2. Governing Decision Principle</w:t>
+        <w:t>SQL Skills the Project Should Demonstrate</w:t>
       </w:r>
     </w:p>
     <w:p>
       <w:r>
-        <w:rPr>
-          <w:b/>
-        </w:rPr>
-        <w:t xml:space="preserve">Primary rule: </w:t>
+        <w:t>SELECT, WHERE, ORDER BY • INNER JOIN and LEFT JOIN • GROUP BY and aggregate functions • CASE • COALESCE • CTEs • Subqueries • Window functions including ranking and comparison • ROUND and financial calculations • Expected-versus-actual variance calculations • Conditional aggregation • Data-quality and referential-integrity checks</w:t>
       </w:r>
+    </w:p>
+    <w:p>
+      <w:pPr>
+        <w:pStyle w:val="Heading1"/>
+      </w:pPr>
       <w:r>
-        <w:t>Do not recommend a hero or team solely because historical damage is lower.</w:t>
+        <w:t>Final Story</w:t>
       </w:r>
     </w:p>
     <w:p>
       <w:r>
-        <w:t>Mission success, civilian safety, and adequate threat response take precedence over minimizing infrastructure damage. Damage reduction becomes a decision criterion only after the deployment is judged capable of addressing the threat.</w:t>
+        <w:t>The project should answer a harder question than 'Who is strongest?' or 'Who causes the least damage?' Leadership needs to know whether a deployment was strong enough for the threat, whether it achieved the objective, whether the resulting damage was reasonable in context, and whether the financial cost was justified. The analyst's job is to connect mission, villain, hero, damage, cost, outcome, attribution, and uncertainty into a recommendation that can be defended.</w:t>
       </w:r>
     </w:p>
     <w:p>
-      <w:r>
-        <w:t>Your analysis should therefore examine the full chain: villain threat -&gt; required capability -&gt; heroes/teams deployed -&gt; mission outcome -&gt; duration -&gt; infrastructure damage -&gt; repair/financial impact.</w:t>
-      </w:r>
-    </w:p>
-    <w:p>
-      <w:pPr>
-        <w:pStyle w:val="Heading1"/>
-      </w:pPr>
-      <w:r>
-        <w:t>3. What Leadership Wants From You</w:t>
-      </w:r>
-    </w:p>
-    <w:p>
-      <w:pPr>
-        <w:pStyle w:val="ListBullet"/>
-      </w:pPr>
-      <w:r>
-        <w:t>Identify where villain threat classifications are supported, contradicted, or complicated by historical mission results.</w:t>
-      </w:r>
-    </w:p>
-    <w:p>
-      <w:pPr>
-        <w:pStyle w:val="ListBullet"/>
-      </w:pPr>
-      <w:r>
-        <w:t>Determine which heroes and team combinations are effective at each level of threat.</w:t>
-      </w:r>
-    </w:p>
-    <w:p>
-      <w:pPr>
-        <w:pStyle w:val="ListBullet"/>
-      </w:pPr>
-      <w:r>
-        <w:t>Identify evidence of over-deployment, where a lower-impact response may have achieved a comparable result.</w:t>
-      </w:r>
-    </w:p>
-    <w:p>
-      <w:pPr>
-        <w:pStyle w:val="ListBullet"/>
-      </w:pPr>
-      <w:r>
-        <w:t>Identify evidence of under-deployment, where insufficient capability may have prolonged the event, worsened the outcome, or increased eventual damage.</w:t>
-      </w:r>
-    </w:p>
-    <w:p>
-      <w:pPr>
-        <w:pStyle w:val="ListBullet"/>
-      </w:pPr>
-      <w:r>
-        <w:t>Separate unavoidable mission damage from damage that appears excessive for the mission type, threat, and outcome.</w:t>
-      </w:r>
-    </w:p>
-    <w:p>
-      <w:pPr>
-        <w:pStyle w:val="ListBullet"/>
-      </w:pPr>
-      <w:r>
-        <w:t>Develop recommendations that leadership can use as decision support, not as an automatic hero-selection algorithm.</w:t>
-      </w:r>
-    </w:p>
-    <w:p>
-      <w:pPr>
-        <w:pStyle w:val="Heading1"/>
-      </w:pPr>
-      <w:r>
-        <w:t>4. Analytical Guardrails</w:t>
-      </w:r>
-    </w:p>
-    <w:p>
-      <w:pPr>
-        <w:pStyle w:val="ListBullet"/>
-      </w:pPr>
-      <w:r>
-        <w:t>Do not treat correlation as proof that a hero or team caused a mission outcome or damage level.</w:t>
-      </w:r>
-    </w:p>
-    <w:p>
-      <w:pPr>
-        <w:pStyle w:val="ListBullet"/>
-      </w:pPr>
-      <w:r>
-        <w:t>Compare like with like wherever possible: similar mission types, threat levels, villains, and operating conditions.</w:t>
-      </w:r>
-    </w:p>
-    <w:p>
-      <w:pPr>
-        <w:pStyle w:val="ListBullet"/>
-      </w:pPr>
-      <w:r>
-        <w:t>Flag small sample sizes, missing data, preliminary damage estimates, unusual outliers, and changes in reporting quality.</w:t>
-      </w:r>
-    </w:p>
-    <w:p>
-      <w:pPr>
-        <w:pStyle w:val="ListBullet"/>
-      </w:pPr>
-      <w:r>
-        <w:t>Do not hide a poor mission outcome behind a low-damage number.</w:t>
-      </w:r>
-    </w:p>
-    <w:p>
-      <w:pPr>
-        <w:pStyle w:val="ListBullet"/>
-      </w:pPr>
-      <w:r>
-        <w:t>Do not label a high-damage mission inefficient without considering threat severity, civilian risk, and whether the mission succeeded.</w:t>
-      </w:r>
-    </w:p>
-    <w:p>
-      <w:pPr>
-        <w:pStyle w:val="ListBullet"/>
-      </w:pPr>
-      <w:r>
-        <w:t>When the available data cannot support a recommendation, state what additional evidence is required.</w:t>
-      </w:r>
-    </w:p>
-    <w:p>
-      <w:r>
-        <w:br w:type="page"/>
-      </w:r>
-    </w:p>
-    <w:p>
-      <w:pPr>
-        <w:pStyle w:val="Heading1"/>
-      </w:pPr>
-      <w:r>
-        <w:t>5. Mission-Type Question Set</w:t>
-      </w:r>
-    </w:p>
-    <w:p>
-      <w:r>
-        <w:t>For every mission type below, answer all three assigned questions. The three-question structure is deliberate: each mission type must be evaluated through threat, deployment effectiveness, and the tradeoff between mission success and damage.</w:t>
-      </w:r>
-    </w:p>
-    <w:p>
-      <w:pPr>
-        <w:pStyle w:val="Heading2"/>
-      </w:pPr>
-      <w:r>
-        <w:t>5.1 Reconnaissance</w:t>
-      </w:r>
-    </w:p>
-    <w:p>
-      <w:pPr>
-        <w:pStyle w:val="ListNumber"/>
-      </w:pPr>
-      <w:r>
-        <w:t>Which villains or threat profiles most often justify reconnaissance before direct League engagement?</w:t>
-      </w:r>
-    </w:p>
-    <w:p>
-      <w:pPr>
-        <w:pStyle w:val="ListNumber"/>
-      </w:pPr>
-      <w:r>
-        <w:t>Which heroes or team compositions have historically completed reconnaissance successfully with the lowest infrastructure damage?</w:t>
-      </w:r>
-    </w:p>
-    <w:p>
-      <w:pPr>
-        <w:pStyle w:val="ListNumber"/>
-      </w:pPr>
-      <w:r>
-        <w:t>What evidence should trigger escalation from reconnaissance to a stronger response rather than continued observation?</w:t>
-      </w:r>
-    </w:p>
-    <w:p>
+      <w:pPr>
+        <w:jc w:val="center"/>
+      </w:pPr>
       <w:r>
         <w:rPr>
           <w:b/>
+          <w:sz w:val="26"/>
         </w:rPr>
-        <w:t xml:space="preserve">Required conclusion: </w:t>
-      </w:r>
-      <w:r>
-        <w:t>State what the evidence supports, what it does not support, and one operational recommendation or follow-up question.</w:t>
-      </w:r>
-    </w:p>
-    <w:p>
-      <w:pPr>
-        <w:pStyle w:val="Heading2"/>
-      </w:pPr>
-      <w:r>
-        <w:t>5.2 Patrol</w:t>
-      </w:r>
-    </w:p>
-    <w:p>
-      <w:pPr>
-        <w:pStyle w:val="ListNumber"/>
-      </w:pPr>
-      <w:r>
-        <w:t>Which threat levels can be handled effectively through routine patrol rather than a specialized deployment?</w:t>
-      </w:r>
-    </w:p>
-    <w:p>
-      <w:pPr>
-        <w:pStyle w:val="ListNumber"/>
-      </w:pPr>
-      <w:r>
-        <w:t>Which heroes or teams produce the strongest patrol outcomes while keeping damage within an appropriate low-damage range?</w:t>
-      </w:r>
-    </w:p>
-    <w:p>
-      <w:pPr>
-        <w:pStyle w:val="ListNumber"/>
-      </w:pPr>
-      <w:r>
-        <w:t>At what point does repeated villain activity make routine patrol an insufficient response?</w:t>
-      </w:r>
-    </w:p>
-    <w:p>
-      <w:r>
-        <w:rPr>
-          <w:b/>
-        </w:rPr>
-        <w:t xml:space="preserve">Required conclusion: </w:t>
-      </w:r>
-      <w:r>
-        <w:t>State what the evidence supports, what it does not support, and one operational recommendation or follow-up question.</w:t>
-      </w:r>
-    </w:p>
-    <w:p>
-      <w:pPr>
-        <w:pStyle w:val="Heading2"/>
-      </w:pPr>
-      <w:r>
-        <w:t>5.3 Investigation</w:t>
-      </w:r>
-    </w:p>
-    <w:p>
-      <w:pPr>
-        <w:pStyle w:val="ListNumber"/>
-      </w:pPr>
-      <w:r>
-        <w:t>Which villain patterns or incident characteristics indicate that investigation should precede direct intervention?</w:t>
-      </w:r>
-    </w:p>
-    <w:p>
-      <w:pPr>
-        <w:pStyle w:val="ListNumber"/>
-      </w:pPr>
-      <w:r>
-        <w:t>Which heroes or teams achieve successful investigative outcomes without creating unnecessary escalation or damage?</w:t>
-      </w:r>
-    </w:p>
-    <w:p>
-      <w:pPr>
-        <w:pStyle w:val="ListNumber"/>
-      </w:pPr>
-      <w:r>
-        <w:t>What indicators should cause an investigation to be reclassified into a higher-threat mission type?</w:t>
-      </w:r>
-    </w:p>
-    <w:p>
-      <w:r>
-        <w:rPr>
-          <w:b/>
-        </w:rPr>
-        <w:t xml:space="preserve">Required conclusion: </w:t>
-      </w:r>
-      <w:r>
-        <w:t>State what the evidence supports, what it does not support, and one operational recommendation or follow-up question.</w:t>
-      </w:r>
-    </w:p>
-    <w:p>
-      <w:pPr>
-        <w:pStyle w:val="Heading2"/>
-      </w:pPr>
-      <w:r>
-        <w:t>5.4 Extraction</w:t>
-      </w:r>
-    </w:p>
-    <w:p>
-      <w:pPr>
-        <w:pStyle w:val="ListNumber"/>
-      </w:pPr>
-      <w:r>
-        <w:t>How does villain threat level affect the capability required for a successful extraction?</w:t>
-      </w:r>
-    </w:p>
-    <w:p>
-      <w:pPr>
-        <w:pStyle w:val="ListNumber"/>
-      </w:pPr>
-      <w:r>
-        <w:t>Which heroes or team combinations complete extractions effectively while minimizing avoidable infrastructure damage?</w:t>
-      </w:r>
-    </w:p>
-    <w:p>
-      <w:pPr>
-        <w:pStyle w:val="ListNumber"/>
-      </w:pPr>
-      <w:r>
-        <w:t>When does deploying a stronger hero or larger team reduce total risk even if expected collateral damage increases?</w:t>
-      </w:r>
-    </w:p>
-    <w:p>
-      <w:r>
-        <w:rPr>
-          <w:b/>
-        </w:rPr>
-        <w:t xml:space="preserve">Required conclusion: </w:t>
-      </w:r>
-      <w:r>
-        <w:t>State what the evidence supports, what it does not support, and one operational recommendation or follow-up question.</w:t>
-      </w:r>
-    </w:p>
-    <w:p>
-      <w:pPr>
-        <w:pStyle w:val="Heading2"/>
-      </w:pPr>
-      <w:r>
-        <w:t>5.5 Rescue</w:t>
-      </w:r>
-    </w:p>
-    <w:p>
-      <w:pPr>
-        <w:pStyle w:val="ListNumber"/>
-      </w:pPr>
-      <w:r>
-        <w:t>Which villain and threat characteristics are most associated with difficult or high-damage rescue missions?</w:t>
-      </w:r>
-    </w:p>
-    <w:p>
-      <w:pPr>
-        <w:pStyle w:val="ListNumber"/>
-      </w:pPr>
-      <w:r>
-        <w:t>Which heroes or teams provide the best balance of rescue success, mission duration, and infrastructure damage?</w:t>
-      </w:r>
-    </w:p>
-    <w:p>
-      <w:pPr>
-        <w:pStyle w:val="ListNumber"/>
-      </w:pPr>
-      <w:r>
-        <w:t>When should leadership accept higher expected damage because a stronger deployment materially improves the likelihood of protecting civilians?</w:t>
-      </w:r>
-    </w:p>
-    <w:p>
-      <w:r>
-        <w:rPr>
-          <w:b/>
-        </w:rPr>
-        <w:t xml:space="preserve">Required conclusion: </w:t>
-      </w:r>
-      <w:r>
-        <w:t>State what the evidence supports, what it does not support, and one operational recommendation or follow-up question.</w:t>
-      </w:r>
-    </w:p>
-    <w:p>
-      <w:pPr>
-        <w:pStyle w:val="Heading2"/>
-      </w:pPr>
-      <w:r>
-        <w:t>5.6 Containment</w:t>
-      </w:r>
-    </w:p>
-    <w:p>
-      <w:pPr>
-        <w:pStyle w:val="ListNumber"/>
-      </w:pPr>
-      <w:r>
-        <w:t>Which villains are most likely to require containment rather than immediate neutralization or routine response?</w:t>
-      </w:r>
-    </w:p>
-    <w:p>
-      <w:pPr>
-        <w:pStyle w:val="ListNumber"/>
-      </w:pPr>
-      <w:r>
-        <w:t>Which heroes or teams have the strongest successful containment record at comparable threat levels and with the least avoidable damage?</w:t>
-      </w:r>
-    </w:p>
-    <w:p>
-      <w:pPr>
-        <w:pStyle w:val="ListNumber"/>
-      </w:pPr>
-      <w:r>
-        <w:t>What historical evidence indicates that an initially limited containment response is underpowered and should be escalated?</w:t>
-      </w:r>
-    </w:p>
-    <w:p>
-      <w:r>
-        <w:rPr>
-          <w:b/>
-        </w:rPr>
-        <w:t xml:space="preserve">Required conclusion: </w:t>
-      </w:r>
-      <w:r>
-        <w:t>State what the evidence supports, what it does not support, and one operational recommendation or follow-up question.</w:t>
-      </w:r>
-    </w:p>
-    <w:p>
-      <w:pPr>
-        <w:pStyle w:val="Heading2"/>
-      </w:pPr>
-      <w:r>
-        <w:t>5.7 Evacuation</w:t>
-      </w:r>
-    </w:p>
-    <w:p>
-      <w:pPr>
-        <w:pStyle w:val="ListNumber"/>
-      </w:pPr>
-      <w:r>
-        <w:t>Which villain threats and event conditions most strongly predict the need for evacuation?</w:t>
-      </w:r>
-    </w:p>
-    <w:p>
-      <w:pPr>
-        <w:pStyle w:val="ListNumber"/>
-      </w:pPr>
-      <w:r>
-        <w:t>Which deployments have protected civilians effectively while limiting additional damage caused during the evacuation response?</w:t>
-      </w:r>
-    </w:p>
-    <w:p>
-      <w:pPr>
-        <w:pStyle w:val="ListNumber"/>
-      </w:pPr>
-      <w:r>
-        <w:t>How should leadership balance speed, hero capability, team size, and expected damage when evacuation time is limited?</w:t>
-      </w:r>
-    </w:p>
-    <w:p>
-      <w:r>
-        <w:rPr>
-          <w:b/>
-        </w:rPr>
-        <w:t xml:space="preserve">Required conclusion: </w:t>
-      </w:r>
-      <w:r>
-        <w:t>State what the evidence supports, what it does not support, and one operational recommendation or follow-up question.</w:t>
-      </w:r>
-    </w:p>
-    <w:p>
-      <w:pPr>
-        <w:pStyle w:val="Heading2"/>
-      </w:pPr>
-      <w:r>
-        <w:t>5.8 Disaster Response</w:t>
-      </w:r>
-    </w:p>
-    <w:p>
-      <w:pPr>
-        <w:pStyle w:val="ListNumber"/>
-      </w:pPr>
-      <w:r>
-        <w:t>Which threat levels, villains, or event characteristics produce the greatest total operational and infrastructure impact during disaster response?</w:t>
-      </w:r>
-    </w:p>
-    <w:p>
-      <w:pPr>
-        <w:pStyle w:val="ListNumber"/>
-      </w:pPr>
-      <w:r>
-        <w:t>Which heroes or teams have delivered successful disaster outcomes with the strongest balance of capability, speed, and damage control?</w:t>
-      </w:r>
-    </w:p>
-    <w:p>
-      <w:pPr>
-        <w:pStyle w:val="ListNumber"/>
-      </w:pPr>
-      <w:r>
-        <w:t>When does deploying additional capability reduce overall damage by shortening the event, even if the deployment itself carries higher damage risk?</w:t>
-      </w:r>
-    </w:p>
-    <w:p>
-      <w:r>
-        <w:rPr>
-          <w:b/>
-        </w:rPr>
-        <w:t xml:space="preserve">Required conclusion: </w:t>
-      </w:r>
-      <w:r>
-        <w:t>State what the evidence supports, what it does not support, and one operational recommendation or follow-up question.</w:t>
-      </w:r>
-    </w:p>
-    <w:p>
-      <w:pPr>
-        <w:pStyle w:val="Heading2"/>
-      </w:pPr>
-      <w:r>
-        <w:t>5.9 Combat</w:t>
-      </w:r>
-    </w:p>
-    <w:p>
-      <w:pPr>
-        <w:pStyle w:val="ListNumber"/>
-      </w:pPr>
-      <w:r>
-        <w:t>Which villains and threat levels require combat-capable deployments rather than lower-impact mission types?</w:t>
-      </w:r>
-    </w:p>
-    <w:p>
-      <w:pPr>
-        <w:pStyle w:val="ListNumber"/>
-      </w:pPr>
-      <w:r>
-        <w:t>For comparable combat threats, which heroes or teams achieve successful outcomes with the lowest avoidable infrastructure damage?</w:t>
-      </w:r>
-    </w:p>
-    <w:p>
-      <w:pPr>
-        <w:pStyle w:val="ListNumber"/>
-      </w:pPr>
-      <w:r>
-        <w:t>Where has under-deployment led to failure, prolonged combat, or greater eventual damage than a stronger initial response would likely have produced?</w:t>
-      </w:r>
-    </w:p>
-    <w:p>
-      <w:r>
-        <w:rPr>
-          <w:b/>
-        </w:rPr>
-        <w:t xml:space="preserve">Required conclusion: </w:t>
-      </w:r>
-      <w:r>
-        <w:t>State what the evidence supports, what it does not support, and one operational recommendation or follow-up question.</w:t>
-      </w:r>
-    </w:p>
-    <w:p>
-      <w:pPr>
-        <w:pStyle w:val="Heading2"/>
-      </w:pPr>
-      <w:r>
-        <w:t>5.10 Major Threat</w:t>
-      </w:r>
-    </w:p>
-    <w:p>
-      <w:pPr>
-        <w:pStyle w:val="ListNumber"/>
-      </w:pPr>
-      <w:r>
-        <w:t>Which villains consistently produce outcomes or damage that justify Major Threat classification?</w:t>
-      </w:r>
-    </w:p>
-    <w:p>
-      <w:pPr>
-        <w:pStyle w:val="ListNumber"/>
-      </w:pPr>
-      <w:r>
-        <w:t>Which hero and team combinations have historically been effective against Major Threat missions, and what damage range accompanies successful response?</w:t>
-      </w:r>
-    </w:p>
-    <w:p>
-      <w:pPr>
-        <w:pStyle w:val="ListNumber"/>
-      </w:pPr>
-      <w:r>
-        <w:t>What minimum capability appears necessary before a Major Threat deployment can be considered adequately staffed?</w:t>
-      </w:r>
-    </w:p>
-    <w:p>
-      <w:r>
-        <w:rPr>
-          <w:b/>
-        </w:rPr>
-        <w:t xml:space="preserve">Required conclusion: </w:t>
-      </w:r>
-      <w:r>
-        <w:t>State what the evidence supports, what it does not support, and one operational recommendation or follow-up question.</w:t>
-      </w:r>
-    </w:p>
-    <w:p>
-      <w:pPr>
-        <w:pStyle w:val="Heading2"/>
-      </w:pPr>
-      <w:r>
-        <w:t>5.11 Catastrophic Event</w:t>
-      </w:r>
-    </w:p>
-    <w:p>
-      <w:pPr>
-        <w:pStyle w:val="ListNumber"/>
-      </w:pPr>
-      <w:r>
-        <w:t>Which historical indicators distinguish a Catastrophic Event from a Major Threat before full damage is known?</w:t>
-      </w:r>
-    </w:p>
-    <w:p>
-      <w:pPr>
-        <w:pStyle w:val="ListNumber"/>
-      </w:pPr>
-      <w:r>
-        <w:t>Which combinations of heroes, teams, and deployment scale have produced the strongest outcomes in catastrophic conditions?</w:t>
-      </w:r>
-    </w:p>
-    <w:p>
-      <w:pPr>
-        <w:pStyle w:val="ListNumber"/>
-      </w:pPr>
-      <w:r>
-        <w:t>What level of collateral damage should be considered operationally acceptable when reducing deployment strength would materially increase the risk of mission failure or civilian loss?</w:t>
-      </w:r>
-    </w:p>
-    <w:p>
-      <w:r>
-        <w:rPr>
-          <w:b/>
-        </w:rPr>
-        <w:t xml:space="preserve">Required conclusion: </w:t>
-      </w:r>
-      <w:r>
-        <w:t>State what the evidence supports, what it does not support, and one operational recommendation or follow-up question.</w:t>
-      </w:r>
-    </w:p>
-    <w:p>
-      <w:r>
-        <w:br w:type="page"/>
-      </w:r>
-    </w:p>
-    <w:p>
-      <w:pPr>
-        <w:pStyle w:val="Heading1"/>
-      </w:pPr>
-      <w:r>
-        <w:t>6. Cross-Mission Questions</w:t>
-      </w:r>
-    </w:p>
-    <w:p>
-      <w:pPr>
-        <w:pStyle w:val="ListNumber"/>
-      </w:pPr>
-      <w:r>
-        <w:t>Which villains appear under-classified or over-classified when threat level is compared with outcomes, duration, deployment size, and damage?</w:t>
-      </w:r>
-    </w:p>
-    <w:p>
-      <w:pPr>
-        <w:pStyle w:val="ListNumber"/>
-      </w:pPr>
-      <w:r>
-        <w:t>For each threat tier, what appears to be the minimum effective response capability supported by the historical data?</w:t>
-      </w:r>
-    </w:p>
-    <w:p>
-      <w:pPr>
-        <w:pStyle w:val="ListNumber"/>
-      </w:pPr>
-      <w:r>
-        <w:t>Which hero-villain or team-villain combinations repeatedly produce unusually strong or weak outcomes?</w:t>
-      </w:r>
-    </w:p>
-    <w:p>
-      <w:pPr>
-        <w:pStyle w:val="ListNumber"/>
-      </w:pPr>
-      <w:r>
-        <w:t>Where does a stronger initial deployment appear to reduce total damage by shortening or successfully containing the event?</w:t>
-      </w:r>
-    </w:p>
-    <w:p>
-      <w:pPr>
-        <w:pStyle w:val="ListNumber"/>
-      </w:pPr>
-      <w:r>
-        <w:t>Where does deployment strength appear excessive relative to the threat without a corresponding improvement in outcome?</w:t>
-      </w:r>
-    </w:p>
-    <w:p>
-      <w:pPr>
-        <w:pStyle w:val="ListNumber"/>
-      </w:pPr>
-      <w:r>
-        <w:t>Which findings are robust enough to support a League recommendation, and which require additional missions or better data?</w:t>
-      </w:r>
-    </w:p>
-    <w:p>
-      <w:pPr>
-        <w:pStyle w:val="Heading1"/>
-      </w:pPr>
-      <w:r>
-        <w:t>7. Required Recommendations to the League</w:t>
-      </w:r>
-    </w:p>
-    <w:p>
-      <w:r>
-        <w:t>Your final recommendations should not produce a universal ranking of heroes. Build a threat-appropriate decision framework. For each recommendation, show the evidence and the tradeoff being managed.</w:t>
-      </w:r>
-    </w:p>
-    <w:tbl>
-      <w:tblPr>
-        <w:tblStyle w:val="TableGrid"/>
-        <w:tblW w:type="auto" w:w="0"/>
-        <w:jc w:val="center"/>
-        <w:tblLook w:firstColumn="1" w:firstRow="1" w:lastColumn="0" w:lastRow="0" w:noHBand="0" w:noVBand="1" w:val="04A0"/>
-      </w:tblPr>
-      <w:tblGrid>
-        <w:gridCol w:w="2016"/>
-        <w:gridCol w:w="2016"/>
-        <w:gridCol w:w="2016"/>
-        <w:gridCol w:w="2016"/>
-        <w:gridCol w:w="2016"/>
-      </w:tblGrid>
-      <w:tr>
-        <w:tc>
-          <w:tcPr>
-            <w:tcW w:type="dxa" w:w="2016"/>
-          </w:tcPr>
-          <w:p>
-            <w:r>
-              <w:rPr>
-                <w:b/>
-              </w:rPr>
-              <w:t>Threat / Mission Context</w:t>
-            </w:r>
-          </w:p>
-        </w:tc>
-        <w:tc>
-          <w:tcPr>
-            <w:tcW w:type="dxa" w:w="2016"/>
-          </w:tcPr>
-          <w:p>
-            <w:r>
-              <w:rPr>
-                <w:b/>
-              </w:rPr>
-              <w:t>Minimum Capability</w:t>
-            </w:r>
-          </w:p>
-        </w:tc>
-        <w:tc>
-          <w:tcPr>
-            <w:tcW w:type="dxa" w:w="2016"/>
-          </w:tcPr>
-          <w:p>
-            <w:r>
-              <w:rPr>
-                <w:b/>
-              </w:rPr>
-              <w:t>Effective Historical Options</w:t>
-            </w:r>
-          </w:p>
-        </w:tc>
-        <w:tc>
-          <w:tcPr>
-            <w:tcW w:type="dxa" w:w="2016"/>
-          </w:tcPr>
-          <w:p>
-            <w:r>
-              <w:rPr>
-                <w:b/>
-              </w:rPr>
-              <w:t>Expected Damage / Risk</w:t>
-            </w:r>
-          </w:p>
-        </w:tc>
-        <w:tc>
-          <w:tcPr>
-            <w:tcW w:type="dxa" w:w="2016"/>
-          </w:tcPr>
-          <w:p>
-            <w:r>
-              <w:rPr>
-                <w:b/>
-              </w:rPr>
-              <w:t>Escalation Trigger</w:t>
-            </w:r>
-          </w:p>
-        </w:tc>
-      </w:tr>
-      <w:tr>
-        <w:tc>
-          <w:tcPr>
-            <w:tcW w:type="dxa" w:w="2016"/>
-          </w:tcPr>
-          <w:p>
-            <w:r>
-              <w:t>To be determined from analysis</w:t>
-            </w:r>
-          </w:p>
-        </w:tc>
-        <w:tc>
-          <w:tcPr>
-            <w:tcW w:type="dxa" w:w="2016"/>
-          </w:tcPr>
-          <w:p>
-            <w:r>
-              <w:t>To be determined from analysis</w:t>
-            </w:r>
-          </w:p>
-        </w:tc>
-        <w:tc>
-          <w:tcPr>
-            <w:tcW w:type="dxa" w:w="2016"/>
-          </w:tcPr>
-          <w:p>
-            <w:r>
-              <w:t>To be determined from analysis</w:t>
-            </w:r>
-          </w:p>
-        </w:tc>
-        <w:tc>
-          <w:tcPr>
-            <w:tcW w:type="dxa" w:w="2016"/>
-          </w:tcPr>
-          <w:p>
-            <w:r>
-              <w:t>To be determined from analysis</w:t>
-            </w:r>
-          </w:p>
-        </w:tc>
-        <w:tc>
-          <w:tcPr>
-            <w:tcW w:type="dxa" w:w="2016"/>
-          </w:tcPr>
-          <w:p>
-            <w:r>
-              <w:t>To be determined from analysis</w:t>
-            </w:r>
-          </w:p>
-        </w:tc>
-      </w:tr>
-      <w:tr>
-        <w:tc>
-          <w:tcPr>
-            <w:tcW w:type="dxa" w:w="2016"/>
-          </w:tcPr>
-          <w:p>
-            <w:r>
-              <w:t>To be determined from analysis</w:t>
-            </w:r>
-          </w:p>
-        </w:tc>
-        <w:tc>
-          <w:tcPr>
-            <w:tcW w:type="dxa" w:w="2016"/>
-          </w:tcPr>
-          <w:p>
-            <w:r>
-              <w:t>To be determined from analysis</w:t>
-            </w:r>
-          </w:p>
-        </w:tc>
-        <w:tc>
-          <w:tcPr>
-            <w:tcW w:type="dxa" w:w="2016"/>
-          </w:tcPr>
-          <w:p>
-            <w:r>
-              <w:t>To be determined from analysis</w:t>
-            </w:r>
-          </w:p>
-        </w:tc>
-        <w:tc>
-          <w:tcPr>
-            <w:tcW w:type="dxa" w:w="2016"/>
-          </w:tcPr>
-          <w:p>
-            <w:r>
-              <w:t>To be determined from analysis</w:t>
-            </w:r>
-          </w:p>
-        </w:tc>
-        <w:tc>
-          <w:tcPr>
-            <w:tcW w:type="dxa" w:w="2016"/>
-          </w:tcPr>
-          <w:p>
-            <w:r>
-              <w:t>To be determined from analysis</w:t>
-            </w:r>
-          </w:p>
-        </w:tc>
-      </w:tr>
-      <w:tr>
-        <w:tc>
-          <w:tcPr>
-            <w:tcW w:type="dxa" w:w="2016"/>
-          </w:tcPr>
-          <w:p>
-            <w:r>
-              <w:t>To be determined from analysis</w:t>
-            </w:r>
-          </w:p>
-        </w:tc>
-        <w:tc>
-          <w:tcPr>
-            <w:tcW w:type="dxa" w:w="2016"/>
-          </w:tcPr>
-          <w:p>
-            <w:r>
-              <w:t>To be determined from analysis</w:t>
-            </w:r>
-          </w:p>
-        </w:tc>
-        <w:tc>
-          <w:tcPr>
-            <w:tcW w:type="dxa" w:w="2016"/>
-          </w:tcPr>
-          <w:p>
-            <w:r>
-              <w:t>To be determined from analysis</w:t>
-            </w:r>
-          </w:p>
-        </w:tc>
-        <w:tc>
-          <w:tcPr>
-            <w:tcW w:type="dxa" w:w="2016"/>
-          </w:tcPr>
-          <w:p>
-            <w:r>
-              <w:t>To be determined from analysis</w:t>
-            </w:r>
-          </w:p>
-        </w:tc>
-        <w:tc>
-          <w:tcPr>
-            <w:tcW w:type="dxa" w:w="2016"/>
-          </w:tcPr>
-          <w:p>
-            <w:r>
-              <w:t>To be determined from analysis</w:t>
-            </w:r>
-          </w:p>
-        </w:tc>
-      </w:tr>
-      <w:tr>
-        <w:tc>
-          <w:tcPr>
-            <w:tcW w:type="dxa" w:w="2016"/>
-          </w:tcPr>
-          <w:p>
-            <w:r>
-              <w:t>To be determined from analysis</w:t>
-            </w:r>
-          </w:p>
-        </w:tc>
-        <w:tc>
-          <w:tcPr>
-            <w:tcW w:type="dxa" w:w="2016"/>
-          </w:tcPr>
-          <w:p>
-            <w:r>
-              <w:t>To be determined from analysis</w:t>
-            </w:r>
-          </w:p>
-        </w:tc>
-        <w:tc>
-          <w:tcPr>
-            <w:tcW w:type="dxa" w:w="2016"/>
-          </w:tcPr>
-          <w:p>
-            <w:r>
-              <w:t>To be determined from analysis</w:t>
-            </w:r>
-          </w:p>
-        </w:tc>
-        <w:tc>
-          <w:tcPr>
-            <w:tcW w:type="dxa" w:w="2016"/>
-          </w:tcPr>
-          <w:p>
-            <w:r>
-              <w:t>To be determined from analysis</w:t>
-            </w:r>
-          </w:p>
-        </w:tc>
-        <w:tc>
-          <w:tcPr>
-            <w:tcW w:type="dxa" w:w="2016"/>
-          </w:tcPr>
-          <w:p>
-            <w:r>
-              <w:t>To be determined from analysis</w:t>
-            </w:r>
-          </w:p>
-        </w:tc>
-      </w:tr>
-      <w:tr>
-        <w:tc>
-          <w:tcPr>
-            <w:tcW w:type="dxa" w:w="2016"/>
-          </w:tcPr>
-          <w:p>
-            <w:r>
-              <w:t>To be determined from analysis</w:t>
-            </w:r>
-          </w:p>
-        </w:tc>
-        <w:tc>
-          <w:tcPr>
-            <w:tcW w:type="dxa" w:w="2016"/>
-          </w:tcPr>
-          <w:p>
-            <w:r>
-              <w:t>To be determined from analysis</w:t>
-            </w:r>
-          </w:p>
-        </w:tc>
-        <w:tc>
-          <w:tcPr>
-            <w:tcW w:type="dxa" w:w="2016"/>
-          </w:tcPr>
-          <w:p>
-            <w:r>
-              <w:t>To be determined from analysis</w:t>
-            </w:r>
-          </w:p>
-        </w:tc>
-        <w:tc>
-          <w:tcPr>
-            <w:tcW w:type="dxa" w:w="2016"/>
-          </w:tcPr>
-          <w:p>
-            <w:r>
-              <w:t>To be determined from analysis</w:t>
-            </w:r>
-          </w:p>
-        </w:tc>
-        <w:tc>
-          <w:tcPr>
-            <w:tcW w:type="dxa" w:w="2016"/>
-          </w:tcPr>
-          <w:p>
-            <w:r>
-              <w:t>To be determined from analysis</w:t>
-            </w:r>
-          </w:p>
-        </w:tc>
-      </w:tr>
-    </w:tbl>
-    <w:p>
-      <w:pPr>
-        <w:pStyle w:val="Heading1"/>
-      </w:pPr>
-      <w:r>
-        <w:t>8. Deliverables</w:t>
-      </w:r>
-    </w:p>
-    <w:p>
-      <w:pPr>
-        <w:pStyle w:val="ListBullet"/>
-      </w:pPr>
-      <w:r>
-        <w:t>A concise executive summary suitable for senior international stakeholders.</w:t>
-      </w:r>
-    </w:p>
-    <w:p>
-      <w:pPr>
-        <w:pStyle w:val="ListBullet"/>
-      </w:pPr>
-      <w:r>
-        <w:t>A mission-type findings section answering all three assigned questions for each mission type.</w:t>
-      </w:r>
-    </w:p>
-    <w:p>
-      <w:pPr>
-        <w:pStyle w:val="ListBullet"/>
-      </w:pPr>
-      <w:r>
-        <w:t>A villain threat assessment identifying patterns, exceptions, and classifications requiring review.</w:t>
-      </w:r>
-    </w:p>
-    <w:p>
-      <w:pPr>
-        <w:pStyle w:val="ListBullet"/>
-      </w:pPr>
-      <w:r>
-        <w:t>A hero/team deployment assessment focused on effectiveness at comparable threat levels.</w:t>
-      </w:r>
-    </w:p>
-    <w:p>
-      <w:pPr>
-        <w:pStyle w:val="ListBullet"/>
-      </w:pPr>
-      <w:r>
-        <w:t>A damage analysis distinguishing low damage, justified high damage, and potentially avoidable high damage.</w:t>
-      </w:r>
-    </w:p>
-    <w:p>
-      <w:pPr>
-        <w:pStyle w:val="ListBullet"/>
-      </w:pPr>
-      <w:r>
-        <w:t>A final threat-appropriate deployment recommendation framework with clear escalation conditions.</w:t>
-      </w:r>
-    </w:p>
-    <w:p>
-      <w:pPr>
-        <w:pStyle w:val="ListBullet"/>
-      </w:pPr>
-      <w:r>
-        <w:t>A short limitations section identifying assumptions, missing data, and questions that cannot yet be answered defensibly.</w:t>
-      </w:r>
-    </w:p>
-    <w:p>
-      <w:pPr>
-        <w:pStyle w:val="Heading1"/>
-      </w:pPr>
-      <w:r>
-        <w:t>9. Communication Standard</w:t>
-      </w:r>
-    </w:p>
-    <w:p>
-      <w:r>
-        <w:t>Assume leadership may request your conclusion in a ten-minute briefing, an email, or a short mobile message while traveling. Your underlying analysis may be detailed; your recommendation must remain clear when compressed. Lead with the decision-relevant finding, state the evidence that matters, identify material uncertainty, and make the next action explicit.</w:t>
-      </w:r>
-    </w:p>
-    <w:p>
-      <w:pPr>
-        <w:pStyle w:val="Heading1"/>
-      </w:pPr>
-      <w:r>
-        <w:t>10. Director's Closing Instruction</w:t>
-      </w:r>
-    </w:p>
-    <w:p>
-      <w:r>
-        <w:rPr>
-          <w:b/>
-        </w:rPr>
-        <w:t>Do not optimize the League for clean spreadsheets.</w:t>
-      </w:r>
-    </w:p>
-    <w:p>
-      <w:r>
-        <w:t>A low-damage failure is still a failure. A high-damage success may be justified when the alternative is catastrophic. Your job is to determine where the line sits, explain why it sits there, and give leadership evidence they can defend.</w:t>
+        <w:t>Capability → Outcome → Damage Context → Cost → Recommendation</w:t>
       </w:r>
     </w:p>
     <w:sectPr>
-      <w:headerReference w:type="default" r:id="rId9"/>
-      <w:footerReference w:type="default" r:id="rId10"/>
+      <w:footerReference w:type="default" r:id="rId9"/>
       <w:pgSz w:w="12240" w:h="15840"/>
       <w:pgMar w:top="936" w:right="1080" w:bottom="936" w:left="1080" w:header="720" w:footer="720" w:gutter="0"/>
       <w:cols w:space="720"/>
@@ -1389,32 +1312,12 @@
     </w:pPr>
     <w:r>
       <w:rPr>
-        <w:color w:val="646464"/>
         <w:sz w:val="16"/>
       </w:rPr>
-      <w:t>International Superhuman Operations Oversight | Analyst Assignment Dossier</w:t>
+      <w:t>League Analyst Dossier v2.0 | Superhero Analysis</w:t>
     </w:r>
   </w:p>
 </w:ftr>
-</file>
-
-<file path=word/header1.xml><?xml version="1.0" encoding="utf-8"?>
-<w:hdr xmlns:m="http://schemas.openxmlformats.org/officeDocument/2006/math" xmlns:mc="http://schemas.openxmlformats.org/markup-compatibility/2006" xmlns:mo="http://schemas.microsoft.com/office/mac/office/2008/main" xmlns:mv="urn:schemas-microsoft-com:mac:vml" xmlns:o="urn:schemas-microsoft-com:office:office" xmlns:r="http://schemas.openxmlformats.org/officeDocument/2006/relationships" xmlns:v="urn:schemas-microsoft-com:vml" xmlns:w10="urn:schemas-microsoft-com:office:word" xmlns:w14="http://schemas.microsoft.com/office/word/2010/wordml" xmlns:w="http://schemas.openxmlformats.org/wordprocessingml/2006/main" xmlns:wne="http://schemas.microsoft.com/office/word/2006/wordml" xmlns:wp14="http://schemas.microsoft.com/office/word/2010/wordprocessingDrawing" xmlns:wp="http://schemas.openxmlformats.org/drawingml/2006/wordprocessingDrawing" xmlns:wpc="http://schemas.microsoft.com/office/word/2010/wordprocessingCanvas" xmlns:wpg="http://schemas.microsoft.com/office/word/2010/wordprocessingGroup" xmlns:wpi="http://schemas.microsoft.com/office/word/2010/wordprocessingInk" xmlns:wps="http://schemas.microsoft.com/office/word/2010/wordprocessingShape" mc:Ignorable="w14 wp14">
-  <w:p>
-    <w:pPr>
-      <w:pStyle w:val="Header"/>
-      <w:jc w:val="right"/>
-    </w:pPr>
-    <w:r>
-      <w:rPr>
-        <w:b/>
-        <w:color w:val="5A5A5A"/>
-        <w:sz w:val="16"/>
-      </w:rPr>
-      <w:t>INTERNATIONAL SUPERHUMAN OPERATIONS OVERSIGHT</w:t>
-    </w:r>
-  </w:p>
-</w:hdr>
 </file>
 
 <file path=word/numbering.xml><?xml version="1.0" encoding="utf-8"?>
@@ -1782,7 +1685,7 @@
     <w:rsid w:val="00FC693F"/>
     <w:rPr>
       <w:rFonts w:ascii="Aptos" w:hAnsi="Aptos"/>
-      <w:sz w:val="20"/>
+      <w:sz w:val="19"/>
     </w:rPr>
   </w:style>
   <w:style w:type="paragraph" w:styleId="Header">
@@ -1848,7 +1751,7 @@
       <w:b/>
       <w:bCs/>
       <w:color w:val="365F91" w:themeColor="accent1" w:themeShade="BF"/>
-      <w:sz w:val="34"/>
+      <w:sz w:val="32"/>
       <w:szCs w:val="28"/>
     </w:rPr>
   </w:style>
@@ -1868,11 +1771,11 @@
       <w:outlineLvl w:val="1"/>
     </w:pPr>
     <w:rPr>
-      <w:rFonts w:asciiTheme="majorHAnsi" w:eastAsiaTheme="majorEastAsia" w:hAnsiTheme="majorHAnsi" w:cstheme="majorBidi" w:ascii="Aptos" w:hAnsi="Aptos"/>
+      <w:rFonts w:asciiTheme="majorHAnsi" w:eastAsiaTheme="majorEastAsia" w:hAnsiTheme="majorHAnsi" w:cstheme="majorBidi" w:ascii="Aptos Display" w:hAnsi="Aptos Display"/>
       <w:b/>
       <w:bCs/>
       <w:color w:val="4F81BD" w:themeColor="accent1"/>
-      <w:sz w:val="25"/>
+      <w:sz w:val="24"/>
       <w:szCs w:val="26"/>
     </w:rPr>
   </w:style>
@@ -2138,7 +2041,7 @@
       <w:color w:val="17365D" w:themeColor="text2" w:themeShade="BF"/>
       <w:spacing w:val="5"/>
       <w:kern w:val="28"/>
-      <w:sz w:val="52"/>
+      <w:sz w:val="48"/>
       <w:szCs w:val="52"/>
     </w:rPr>
   </w:style>

</xml_diff>